<commit_message>
Update docs for phim-cach-nhiet
</commit_message>
<xml_diff>
--- a/phim-cach-nhiet.docx
+++ b/phim-cach-nhiet.docx
@@ -393,115 +393,44 @@
         <w:spacing w:lineRule="auto"/>
       </w:pPr>
       <w:r>
+        <w:rPr/>
+        <w:t xml:space="preserve">           Auto365 thuộc 365Group, là điểm 3M Pro Shop &amp; 3M Training Center: tư vấn, thi công và đào tạo phim cách nhiệt 3M.         </w:t>
+      </w:r>
+    </w:p>
+    <w:p>
+      <w:pPr>
+        <w:spacing w:lineRule="auto"/>
+      </w:pPr>
+      <w:r>
+        <w:rPr/>
+        <w:t xml:space="preserve">           Nếu đang tìm </w:t>
+      </w:r>
+      <w:r>
         <w:rPr>
           <w:b/>
         </w:rPr>
-        <w:t xml:space="preserve">Auto365</w:t>
-      </w:r>
-    </w:p>
-    <w:p>
-      <w:pPr>
-        <w:spacing w:lineRule="auto"/>
-      </w:pPr>
-      <w:r>
-        <w:rPr/>
-        <w:t xml:space="preserve"> là hệ thống nâng cấp xe trực thuộc </w:t>
-      </w:r>
-    </w:p>
-    <w:p>
-      <w:pPr>
-        <w:spacing w:lineRule="auto"/>
-      </w:pPr>
-      <w:r>
-        <w:rPr>
-          <w:b/>
-        </w:rPr>
-        <w:t xml:space="preserve">365Group</w:t>
-      </w:r>
-    </w:p>
-    <w:p>
-      <w:pPr>
-        <w:spacing w:lineRule="auto"/>
-      </w:pPr>
-      <w:r>
-        <w:rPr/>
-        <w:t xml:space="preserve">. Trong hệ sinh thái này,           </w:t>
-      </w:r>
-    </w:p>
-    <w:p>
-      <w:pPr>
-        <w:spacing w:lineRule="auto"/>
-      </w:pPr>
+        <w:t xml:space="preserve">địa chỉ dán phim cách nhiệt ô tô</w:t>
+      </w:r>
+      <w:r>
+        <w:rPr/>
+        <w:t xml:space="preserve">, khách hàng có thể đặt lịch tư vấn tại           </w:t>
+      </w:r>
       <w:r>
         <w:rPr>
           <w:b/>
         </w:rPr>
         <w:t xml:space="preserve">Auto365.vn - Trụ Sở Chính</w:t>
       </w:r>
-    </w:p>
-    <w:p>
-      <w:pPr>
-        <w:spacing w:lineRule="auto"/>
-      </w:pPr>
-      <w:r>
-        <w:rPr/>
-        <w:t xml:space="preserve"> và </w:t>
-      </w:r>
-    </w:p>
-    <w:p>
-      <w:pPr>
-        <w:spacing w:lineRule="auto"/>
-      </w:pPr>
+      <w:r>
+        <w:rPr/>
+        <w:t xml:space="preserve"> hoặc </w:t>
+      </w:r>
       <w:r>
         <w:rPr>
           <w:b/>
         </w:rPr>
         <w:t xml:space="preserve">3M Pro Shop &amp; 3M Training Center</w:t>
       </w:r>
-    </w:p>
-    <w:p>
-      <w:pPr>
-        <w:spacing w:lineRule="auto"/>
-      </w:pPr>
-      <w:r>
-        <w:rPr/>
-        <w:t xml:space="preserve"> phục vụ tư           vấn, thi công và đào tạo kỹ thuật phim cách nhiệt 3M. Với nhóm phim cách nhiệt 3M, Auto365 tư vấn theo thông           tin gói phim, mã phim, vị trí kính và điều kiện bảo hành áp dụng tại thời điểm thi công.         </w:t>
-      </w:r>
-    </w:p>
-    <w:p>
-      <w:pPr>
-        <w:spacing w:lineRule="auto"/>
-      </w:pPr>
-      <w:r>
-        <w:rPr/>
-        <w:t xml:space="preserve">           Nếu đang tìm </w:t>
-      </w:r>
-      <w:r>
-        <w:rPr>
-          <w:b/>
-        </w:rPr>
-        <w:t xml:space="preserve">địa chỉ dán phim cách nhiệt ô tô</w:t>
-      </w:r>
-      <w:r>
-        <w:rPr/>
-        <w:t xml:space="preserve">, khách hàng có thể đặt lịch tư vấn tại           </w:t>
-      </w:r>
-      <w:r>
-        <w:rPr>
-          <w:b/>
-        </w:rPr>
-        <w:t xml:space="preserve">Auto365.vn - Trụ Sở Chính</w:t>
-      </w:r>
-      <w:r>
-        <w:rPr/>
-        <w:t xml:space="preserve"> hoặc </w:t>
-      </w:r>
-      <w:r>
-        <w:rPr>
-          <w:b/>
-        </w:rPr>
-        <w:t xml:space="preserve">3M Pro Shop &amp; 3M Training Center</w:t>
-      </w:r>
       <w:r>
         <w:rPr/>
         <w:t xml:space="preserve"> để được           kiểm tra kính xe, tư vấn mã phim theo từng vị trí kính và hướng dẫn bảo hành điện tử sau thi công.         </w:t>
@@ -542,6 +471,25 @@
       <w:r>
         <w:rPr/>
         <w:t xml:space="preserve">Không nên hiểu dán phim cách nhiệt chỉ là “làm tối kính”. Đây là giải pháp kiểm soát nhiệt, ánh sáng, tia               UV và độ chói đi vào khoang cabin. Cấu hình phù hợp cần được chọn theo từng vị trí kính như kính lái, kính               sườn, kính lưng, cửa sổ trời hoặc panorama, đồng thời đối chiếu TSER, VLT, UVR, IRR, giảm lóa và chính               sách bảo hành.</w:t>
+      </w:r>
+    </w:p>
+    <w:p>
+      <w:pPr>
+        <w:pStyle w:val="Heading2"/>
+        <w:spacing w:lineRule="auto"/>
+      </w:pPr>
+      <w:r>
+        <w:rPr/>
+        <w:t xml:space="preserve">Tóm tắt nhanh</w:t>
+      </w:r>
+    </w:p>
+    <w:p>
+      <w:pPr>
+        <w:spacing w:lineRule="auto"/>
+      </w:pPr>
+      <w:r>
+        <w:rPr/>
+        <w:t xml:space="preserve">Phim cách nhiệt ô tô là lớp phim dán lên kính xe để hỗ trợ giảm nhiệt, giảm chói, hạn chế tia UV và cải thiện sự riêng tư trong khoang xe. Khi chọn phim, người dùng nên xem đồng thời TSER, VLT, IRR, UVR, độ giảm chói, vị trí kính và nhu cầu sử dụng thực tế. Auto365.vn - Trụ Sở Chính tư vấn phim cách nhiệt theo dòng xe, kính nguyên bản, mã phim, ngân sách và điều kiện vận hành.</w:t>
       </w:r>
     </w:p>
     <w:p>
@@ -575,7 +523,7 @@
           <w:color w:val="000000"/>
           <w:sz w:val="22"/>
         </w:rPr>
-        <w:t xml:space="preserve">Hỗ trợ giảm đáng kể                   nhiệt lượng từ tia hồng ngoại (IR) và năng lượng mặt trời truyền qua mặt kính, giúp không khí trong xe                   dịu bớt đi khi di chuyển dưới thời tiết nắng nóng.</w:t>
+        <w:t xml:space="preserve">Hỗ trợ giảm một phần nhiệt lượng truyền qua kính, giúp khoang xe dịu hơn trong một số điều kiện sử dụng.</w:t>
       </w:r>
     </w:p>
     <w:p>
@@ -712,7 +660,7 @@
           <w:color w:val="000000"/>
           <w:sz w:val="22"/>
         </w:rPr>
-        <w:t xml:space="preserve">Nhờ khoang lái không bị                   hấp nhiệt quá mức, hệ thống điều hòa hoạt động hiệu quả hơn, có thể hỗ trợ tối ưu tiêu hao năng lượng.                 </w:t>
+        <w:t xml:space="preserve">Nhờ khoang lái không bị                   hấp nhiệt quá mức, hệ thống điều hòa hoạt động hiệu quả hơn, có thể góp phần giảm tải cho hệ thống điều hòa trong một số điều kiện sử dụng.                 </w:t>
       </w:r>
     </w:p>
     <w:p>
@@ -1309,6 +1257,15 @@
       </w:pPr>
       <w:r>
         <w:rPr/>
+      </w:r>
+    </w:p>
+    <w:p>
+      <w:pPr>
+        <w:spacing w:lineRule="auto"/>
+      </w:pPr>
+      <w:r>
+        <w:rPr/>
+        <w:t xml:space="preserve">Nguồn: Catalog 3M | 365Group, áp dụng từ 06/2026 — điều kiện đo kính xanh 6mm, VLT 73%.</w:t>
       </w:r>
     </w:p>
     <w:p>
@@ -5386,30 +5343,429 @@
     </w:p>
     <w:p>
       <w:pPr>
-        <w:pStyle w:val="Heading3"/>
-        <w:spacing w:lineRule="auto"/>
-      </w:pPr>
-      <w:r>
-        <w:rPr/>
-        <w:t xml:space="preserve">Phim cách nhiệt giá rẻ có nên dán không?</w:t>
-      </w:r>
-    </w:p>
-    <w:p>
-      <w:pPr>
-        <w:spacing w:lineRule="auto"/>
-      </w:pPr>
-      <w:r>
-        <w:rPr/>
-        <w:t xml:space="preserve">Phim cách nhiệt giá rẻ có thể phù hợp với nhu cầu cơ bản như tăng riêng tư hoặc giảm chói nhẹ. Tuy nhiên,           khách hàng cần kiểm tra kỹ mã phim, thông số, độ bền màu, khả năng bong rộp, độ trong khi quan sát và chính           sách bảo hành.</w:t>
-      </w:r>
-    </w:p>
-    <w:p>
-      <w:pPr>
-        <w:spacing w:lineRule="auto"/>
-      </w:pPr>
-      <w:r>
-        <w:rPr/>
-        <w:t xml:space="preserve">Với kính lái, không nên chọn phim chỉ vì giá thấp nếu phim làm kính quá tối, khó quan sát khi đi đêm hoặc           không rõ nguồn gốc. Một cấu hình phù hợp cần cân bằng giữa ngân sách, tầm nhìn, khả năng giảm nóng và độ bền           sau thi công.</w:t>
+        <w:pStyle w:val="Heading2"/>
+        <w:spacing w:lineRule="auto"/>
+      </w:pPr>
+      <w:r>
+        <w:rPr/>
+        <w:t xml:space="preserve">Chọn phim cách nhiệt theo vị trí kính</w:t>
+      </w:r>
+    </w:p>
+    <w:p>
+      <w:pPr>
+        <w:spacing w:lineRule="auto"/>
+      </w:pPr>
+      <w:r>
+        <w:rPr/>
+        <w:t xml:space="preserve">Mỗi vị trí kính trên ô tô có yêu cầu khác nhau về tầm nhìn, độ riêng tư, giảm chói và khả năng kiểm soát nhiệt. Vì vậy, không nên chọn cùng một mã phim cho toàn bộ xe nếu chưa được tư vấn theo nhu cầu sử dụng thực tế.</w:t>
+      </w:r>
+    </w:p>
+    <w:tbl>
+      <w:tblPr>
+        <w:tblBorders>
+          <w:top w:val="single" w:sz="2" w:space="0" w:color="000000"/>
+          <w:bottom w:val="single" w:sz="2" w:space="0" w:color="000000"/>
+          <w:left w:val="single" w:sz="2" w:space="0" w:color="000000"/>
+          <w:right w:val="single" w:sz="2" w:space="0" w:color="000000"/>
+        </w:tblBorders>
+        <w:tblCellSpacing w:w="0" w:type="dxa"/>
+        <w:tblCellMar>
+          <w:top w:type="dxa" w:w="80"/>
+          <w:bottom w:type="dxa" w:w="80"/>
+          <w:left w:type="dxa" w:w="160"/>
+          <w:right w:type="dxa" w:w="160"/>
+        </w:tblCellMar>
+        <w:jc w:val="center"/>
+      </w:tblPr>
+      <w:tblGrid>
+        <w:gridCol w:w="2880"/>
+        <w:gridCol w:w="2880"/>
+        <w:gridCol w:w="2880"/>
+      </w:tblGrid>
+      <w:tr>
+        <w:trPr>
+          <w:cantSplit/>
+        </w:trPr>
+        <w:tc>
+          <w:tcPr>
+            <w:tcBorders>
+              <w:top w:val="single" w:sz="1" w:space="0" w:color="000000"/>
+              <w:bottom w:val="single" w:sz="1" w:space="0" w:color="000000"/>
+              <w:left w:val="single" w:sz="1" w:space="0" w:color="000000"/>
+              <w:right w:val="single" w:sz="1" w:space="0" w:color="000000"/>
+            </w:tcBorders>
+          </w:tcPr>
+          <w:p>
+            <w:pPr>
+              <w:spacing w:lineRule="auto"/>
+            </w:pPr>
+            <w:r>
+              <w:rPr/>
+              <w:t xml:space="preserve">Vị trí kính</w:t>
+            </w:r>
+          </w:p>
+        </w:tc>
+        <w:tc>
+          <w:tcPr>
+            <w:tcBorders>
+              <w:top w:val="single" w:sz="1" w:space="0" w:color="000000"/>
+              <w:bottom w:val="single" w:sz="1" w:space="0" w:color="000000"/>
+              <w:left w:val="single" w:sz="1" w:space="0" w:color="000000"/>
+              <w:right w:val="single" w:sz="1" w:space="0" w:color="000000"/>
+            </w:tcBorders>
+          </w:tcPr>
+          <w:p>
+            <w:pPr>
+              <w:spacing w:lineRule="auto"/>
+            </w:pPr>
+            <w:r>
+              <w:rPr/>
+              <w:t xml:space="preserve">Ưu tiên khi chọn phim</w:t>
+            </w:r>
+          </w:p>
+        </w:tc>
+        <w:tc>
+          <w:tcPr>
+            <w:tcBorders>
+              <w:top w:val="single" w:sz="1" w:space="0" w:color="000000"/>
+              <w:bottom w:val="single" w:sz="1" w:space="0" w:color="000000"/>
+              <w:left w:val="single" w:sz="1" w:space="0" w:color="000000"/>
+              <w:right w:val="single" w:sz="1" w:space="0" w:color="000000"/>
+            </w:tcBorders>
+          </w:tcPr>
+          <w:p>
+            <w:pPr>
+              <w:spacing w:lineRule="auto"/>
+            </w:pPr>
+            <w:r>
+              <w:rPr/>
+              <w:t xml:space="preserve">Lưu ý</w:t>
+            </w:r>
+          </w:p>
+        </w:tc>
+      </w:tr>
+      <w:tblGrid>
+        <w:gridCol w:w="2880"/>
+        <w:gridCol w:w="2880"/>
+        <w:gridCol w:w="2880"/>
+      </w:tblGrid>
+      <w:tr>
+        <w:trPr>
+          <w:cantSplit/>
+        </w:trPr>
+        <w:tc>
+          <w:tcPr>
+            <w:tcBorders>
+              <w:top w:val="single" w:sz="1" w:space="0" w:color="000000"/>
+              <w:bottom w:val="single" w:sz="1" w:space="0" w:color="000000"/>
+              <w:left w:val="single" w:sz="1" w:space="0" w:color="000000"/>
+              <w:right w:val="single" w:sz="1" w:space="0" w:color="000000"/>
+            </w:tcBorders>
+          </w:tcPr>
+          <w:p>
+            <w:pPr>
+              <w:spacing w:lineRule="auto"/>
+            </w:pPr>
+            <w:r>
+              <w:rPr/>
+              <w:t xml:space="preserve">Kính lái</w:t>
+            </w:r>
+          </w:p>
+        </w:tc>
+        <w:tc>
+          <w:tcPr>
+            <w:tcBorders>
+              <w:top w:val="single" w:sz="1" w:space="0" w:color="000000"/>
+              <w:bottom w:val="single" w:sz="1" w:space="0" w:color="000000"/>
+              <w:left w:val="single" w:sz="1" w:space="0" w:color="000000"/>
+              <w:right w:val="single" w:sz="1" w:space="0" w:color="000000"/>
+            </w:tcBorders>
+          </w:tcPr>
+          <w:p>
+            <w:pPr>
+              <w:spacing w:lineRule="auto"/>
+            </w:pPr>
+            <w:r>
+              <w:rPr/>
+              <w:t xml:space="preserve">VLT cao, tầm nhìn rõ, giảm chói vừa phải</w:t>
+            </w:r>
+          </w:p>
+        </w:tc>
+        <w:tc>
+          <w:tcPr>
+            <w:tcBorders>
+              <w:top w:val="single" w:sz="1" w:space="0" w:color="000000"/>
+              <w:bottom w:val="single" w:sz="1" w:space="0" w:color="000000"/>
+              <w:left w:val="single" w:sz="1" w:space="0" w:color="000000"/>
+              <w:right w:val="single" w:sz="1" w:space="0" w:color="000000"/>
+            </w:tcBorders>
+          </w:tcPr>
+          <w:p>
+            <w:pPr>
+              <w:spacing w:lineRule="auto"/>
+            </w:pPr>
+            <w:r>
+              <w:rPr/>
+              <w:t xml:space="preserve">Không chọn quá tối; tư vấn theo kính nguyên bản và điều kiện lái đêm</w:t>
+            </w:r>
+          </w:p>
+        </w:tc>
+      </w:tr>
+      <w:tr>
+        <w:trPr>
+          <w:cantSplit/>
+        </w:trPr>
+        <w:tc>
+          <w:tcPr>
+            <w:tcBorders>
+              <w:top w:val="single" w:sz="1" w:space="0" w:color="000000"/>
+              <w:bottom w:val="single" w:sz="1" w:space="0" w:color="000000"/>
+              <w:left w:val="single" w:sz="1" w:space="0" w:color="000000"/>
+              <w:right w:val="single" w:sz="1" w:space="0" w:color="000000"/>
+            </w:tcBorders>
+          </w:tcPr>
+          <w:p>
+            <w:pPr>
+              <w:spacing w:lineRule="auto"/>
+            </w:pPr>
+            <w:r>
+              <w:rPr/>
+              <w:t xml:space="preserve">Kính sườn trước</w:t>
+            </w:r>
+          </w:p>
+        </w:tc>
+        <w:tc>
+          <w:tcPr>
+            <w:tcBorders>
+              <w:top w:val="single" w:sz="1" w:space="0" w:color="000000"/>
+              <w:bottom w:val="single" w:sz="1" w:space="0" w:color="000000"/>
+              <w:left w:val="single" w:sz="1" w:space="0" w:color="000000"/>
+              <w:right w:val="single" w:sz="1" w:space="0" w:color="000000"/>
+            </w:tcBorders>
+          </w:tcPr>
+          <w:p>
+            <w:pPr>
+              <w:spacing w:lineRule="auto"/>
+            </w:pPr>
+            <w:r>
+              <w:rPr/>
+              <w:t xml:space="preserve">Cân bằng riêng tư, tầm nhìn gương, giảm nóng</w:t>
+            </w:r>
+          </w:p>
+        </w:tc>
+        <w:tc>
+          <w:tcPr>
+            <w:tcBorders>
+              <w:top w:val="single" w:sz="1" w:space="0" w:color="000000"/>
+              <w:bottom w:val="single" w:sz="1" w:space="0" w:color="000000"/>
+              <w:left w:val="single" w:sz="1" w:space="0" w:color="000000"/>
+              <w:right w:val="single" w:sz="1" w:space="0" w:color="000000"/>
+            </w:tcBorders>
+          </w:tcPr>
+          <w:p>
+            <w:pPr>
+              <w:spacing w:lineRule="auto"/>
+            </w:pPr>
+            <w:r>
+              <w:rPr/>
+              <w:t xml:space="preserve">Tránh mã quá tối nếu thường đi đêm hoặc trời mưa</w:t>
+            </w:r>
+          </w:p>
+        </w:tc>
+      </w:tr>
+      <w:tr>
+        <w:trPr>
+          <w:cantSplit/>
+        </w:trPr>
+        <w:tc>
+          <w:tcPr>
+            <w:tcBorders>
+              <w:top w:val="single" w:sz="1" w:space="0" w:color="000000"/>
+              <w:bottom w:val="single" w:sz="1" w:space="0" w:color="000000"/>
+              <w:left w:val="single" w:sz="1" w:space="0" w:color="000000"/>
+              <w:right w:val="single" w:sz="1" w:space="0" w:color="000000"/>
+            </w:tcBorders>
+          </w:tcPr>
+          <w:p>
+            <w:pPr>
+              <w:spacing w:lineRule="auto"/>
+            </w:pPr>
+            <w:r>
+              <w:rPr/>
+              <w:t xml:space="preserve">Kính sườn sau</w:t>
+            </w:r>
+          </w:p>
+        </w:tc>
+        <w:tc>
+          <w:tcPr>
+            <w:tcBorders>
+              <w:top w:val="single" w:sz="1" w:space="0" w:color="000000"/>
+              <w:bottom w:val="single" w:sz="1" w:space="0" w:color="000000"/>
+              <w:left w:val="single" w:sz="1" w:space="0" w:color="000000"/>
+              <w:right w:val="single" w:sz="1" w:space="0" w:color="000000"/>
+            </w:tcBorders>
+          </w:tcPr>
+          <w:p>
+            <w:pPr>
+              <w:spacing w:lineRule="auto"/>
+            </w:pPr>
+            <w:r>
+              <w:rPr/>
+              <w:t xml:space="preserve">Ưu tiên riêng tư và giảm nóng</w:t>
+            </w:r>
+          </w:p>
+        </w:tc>
+        <w:tc>
+          <w:tcPr>
+            <w:tcBorders>
+              <w:top w:val="single" w:sz="1" w:space="0" w:color="000000"/>
+              <w:bottom w:val="single" w:sz="1" w:space="0" w:color="000000"/>
+              <w:left w:val="single" w:sz="1" w:space="0" w:color="000000"/>
+              <w:right w:val="single" w:sz="1" w:space="0" w:color="000000"/>
+            </w:tcBorders>
+          </w:tcPr>
+          <w:p>
+            <w:pPr>
+              <w:spacing w:lineRule="auto"/>
+            </w:pPr>
+            <w:r>
+              <w:rPr/>
+              <w:t xml:space="preserve">Có thể chọn mã tối hơn kính trước</w:t>
+            </w:r>
+          </w:p>
+        </w:tc>
+      </w:tr>
+      <w:tr>
+        <w:trPr>
+          <w:cantSplit/>
+        </w:trPr>
+        <w:tc>
+          <w:tcPr>
+            <w:tcBorders>
+              <w:top w:val="single" w:sz="1" w:space="0" w:color="000000"/>
+              <w:bottom w:val="single" w:sz="1" w:space="0" w:color="000000"/>
+              <w:left w:val="single" w:sz="1" w:space="0" w:color="000000"/>
+              <w:right w:val="single" w:sz="1" w:space="0" w:color="000000"/>
+            </w:tcBorders>
+          </w:tcPr>
+          <w:p>
+            <w:pPr>
+              <w:spacing w:lineRule="auto"/>
+            </w:pPr>
+            <w:r>
+              <w:rPr/>
+              <w:t xml:space="preserve">Kính lưng</w:t>
+            </w:r>
+          </w:p>
+        </w:tc>
+        <w:tc>
+          <w:tcPr>
+            <w:tcBorders>
+              <w:top w:val="single" w:sz="1" w:space="0" w:color="000000"/>
+              <w:bottom w:val="single" w:sz="1" w:space="0" w:color="000000"/>
+              <w:left w:val="single" w:sz="1" w:space="0" w:color="000000"/>
+              <w:right w:val="single" w:sz="1" w:space="0" w:color="000000"/>
+            </w:tcBorders>
+          </w:tcPr>
+          <w:p>
+            <w:pPr>
+              <w:spacing w:lineRule="auto"/>
+            </w:pPr>
+            <w:r>
+              <w:rPr/>
+              <w:t xml:space="preserve">Giảm nóng, giảm chói từ sau xe</w:t>
+            </w:r>
+          </w:p>
+        </w:tc>
+        <w:tc>
+          <w:tcPr>
+            <w:tcBorders>
+              <w:top w:val="single" w:sz="1" w:space="0" w:color="000000"/>
+              <w:bottom w:val="single" w:sz="1" w:space="0" w:color="000000"/>
+              <w:left w:val="single" w:sz="1" w:space="0" w:color="000000"/>
+              <w:right w:val="single" w:sz="1" w:space="0" w:color="000000"/>
+            </w:tcBorders>
+          </w:tcPr>
+          <w:p>
+            <w:pPr>
+              <w:spacing w:lineRule="auto"/>
+            </w:pPr>
+            <w:r>
+              <w:rPr/>
+              <w:t xml:space="preserve">Cần kiểm tra camera hoặc gương chiếu hậu</w:t>
+            </w:r>
+          </w:p>
+        </w:tc>
+      </w:tr>
+      <w:tr>
+        <w:trPr>
+          <w:cantSplit/>
+        </w:trPr>
+        <w:tc>
+          <w:tcPr>
+            <w:tcBorders>
+              <w:top w:val="single" w:sz="1" w:space="0" w:color="000000"/>
+              <w:bottom w:val="single" w:sz="1" w:space="0" w:color="000000"/>
+              <w:left w:val="single" w:sz="1" w:space="0" w:color="000000"/>
+              <w:right w:val="single" w:sz="1" w:space="0" w:color="000000"/>
+            </w:tcBorders>
+          </w:tcPr>
+          <w:p>
+            <w:pPr>
+              <w:spacing w:lineRule="auto"/>
+            </w:pPr>
+            <w:r>
+              <w:rPr/>
+              <w:t xml:space="preserve">Cửa sổ trời</w:t>
+            </w:r>
+          </w:p>
+        </w:tc>
+        <w:tc>
+          <w:tcPr>
+            <w:tcBorders>
+              <w:top w:val="single" w:sz="1" w:space="0" w:color="000000"/>
+              <w:bottom w:val="single" w:sz="1" w:space="0" w:color="000000"/>
+              <w:left w:val="single" w:sz="1" w:space="0" w:color="000000"/>
+              <w:right w:val="single" w:sz="1" w:space="0" w:color="000000"/>
+            </w:tcBorders>
+          </w:tcPr>
+          <w:p>
+            <w:pPr>
+              <w:spacing w:lineRule="auto"/>
+            </w:pPr>
+            <w:r>
+              <w:rPr/>
+              <w:t xml:space="preserve">Ưu tiên kiểm soát nhiệt</w:t>
+            </w:r>
+          </w:p>
+        </w:tc>
+        <w:tc>
+          <w:tcPr>
+            <w:tcBorders>
+              <w:top w:val="single" w:sz="1" w:space="0" w:color="000000"/>
+              <w:bottom w:val="single" w:sz="1" w:space="0" w:color="000000"/>
+              <w:left w:val="single" w:sz="1" w:space="0" w:color="000000"/>
+              <w:right w:val="single" w:sz="1" w:space="0" w:color="000000"/>
+            </w:tcBorders>
+          </w:tcPr>
+          <w:p>
+            <w:pPr>
+              <w:spacing w:lineRule="auto"/>
+            </w:pPr>
+            <w:r>
+              <w:rPr/>
+              <w:t xml:space="preserve">Giá theo diện tích thực tế</w:t>
+            </w:r>
+          </w:p>
+        </w:tc>
+      </w:tr>
+    </w:tbl>
+    <w:p>
+      <w:pPr>
+        <w:spacing w:lineRule="auto"/>
+      </w:pPr>
+      <w:r>
+        <w:rPr/>
       </w:r>
     </w:p>
     <w:p>
@@ -5468,7 +5824,22 @@
       </w:pPr>
       <w:r>
         <w:rPr/>
-        <w:t xml:space="preserve">Theo catalog 3M | 365Group áp dụng từ 06/2026, phim cách nhiệt 3M được bảo hành chính hãng 10 năm theo               điều kiện áp dụng khi đã dán trên xe và được kích hoạt bảo hành điện tử 3M. Khách hàng kiểm tra mã phim,               vị trí dán, thông tin gói và tra cứu bảo hành điện tử tại thời điểm bàn giao xe.</w:t>
+        <w:t xml:space="preserve">Theo catalog 3M | 365Group áp dụng từ 06/2026, phim cách nhiệt 3M được bảo hành chính hãng 10 năm theo điều kiện áp dụng khi đã dán trên xe và được kích hoạt bảo hành điện tử 3M. Khách hàng kiểm tra mã phim, vị trí dán, thông tin gói và tra cứu bảo hành điện tử tại thời điểm bàn giao xe.</w:t>
+      </w:r>
+    </w:p>
+    <w:p>
+      <w:pPr>
+        <w:spacing w:lineRule="auto"/>
+      </w:pPr>
+      <w:r>
+        <w:rPr>
+          <w:b/>
+        </w:rPr>
+        <w:t xml:space="preserve">Lưu ý giá:</w:t>
+      </w:r>
+      <w:r>
+        <w:rPr/>
+        <w:t xml:space="preserve"> Bảng giá dưới đây là giá tham khảo tại Auto365 theo catalog 3M | 365Group áp dụng từ 06/2026, không đại diện cho toàn bộ thị trường phim cách nhiệt. Giá thực tế cần được xác nhận theo dòng xe, diện tích kính, tình trạng phim cũ, cửa sổ trời và chính sách áp dụng tại thời điểm tư vấn.</w:t>
       </w:r>
     </w:p>
     <w:tbl>
@@ -5809,7 +6180,7 @@
             </w:pPr>
             <w:r>
               <w:rPr/>
-              <w:t xml:space="preserve">Kính lái IR50 (Gợi ý mang tính tham khảo; cấu hình cuối cần được xác nhận theo kính nguyên bản,                       dòng xe, nhu cầu sử dụng và quy định hiện hành tại thời điểm tư vấn); kính sườn IR25/IR15; kính                       lưng IR25/IR15.</w:t>
+              <w:t xml:space="preserve">Kính lái IR50; kính sườn và kính lưng IR25/IR15.</w:t>
             </w:r>
           </w:p>
         </w:tc>
@@ -6270,7 +6641,7 @@
           <w:color w:val="666666"/>
           <w:sz w:val="21"/>
         </w:rPr>
-        <w:t xml:space="preserve">Nhóm minicar tham khảo theo catalog gồm VinFast VF 3, Wuling Hongguang Mini EV, Bestune               Xiaoma, Minio Green và xe cùng kích thước.</w:t>
+        <w:t xml:space="preserve">Nhóm minicar tham khảo theo catalog gồm VinFast VF 3, Wuling Hongguang Mini EV, Bestune               Xiaoma, VinFast Minio Green và xe cùng kích thước.</w:t>
       </w:r>
     </w:p>
     <w:p>
@@ -6634,7 +7005,7 @@
             </w:pPr>
             <w:r>
               <w:rPr/>
-              <w:t xml:space="preserve">Cửa sổ trời nhỏ: từ 850.000đ — giá tham khảo theo diện tích thực tế, tính theo quy tắc 1/2 hàng                       kính sườn trong bảng dán lẻ.</w:t>
+              <w:t xml:space="preserve">từ 850.000đ — giá tham khảo theo diện tích thực tế, tính theo quy tắc 1/2 hàng kính sườn trong bảng dán lẻ.</w:t>
             </w:r>
           </w:p>
         </w:tc>
@@ -7330,7 +7701,7 @@
       </w:pPr>
       <w:r>
         <w:rPr/>
-        <w:t xml:space="preserve">Thường xuất hiện trong phân khúc xe cao cấp, phim cách nhiệt Cool N Lite cung                 cấp đa dạng cấu hình màng phim.</w:t>
+        <w:t xml:space="preserve">Cool N Lite là một trong các thương hiệu phim cách nhiệt được người dùng tại Việt Nam tham khảo. Khi so sánh, nên xem mã phim cụ thể, thông số công bố và chính sách bảo hành.</w:t>
       </w:r>
     </w:p>
     <w:p>
@@ -7388,7 +7759,7 @@
       </w:pPr>
       <w:r>
         <w:rPr/>
-        <w:t xml:space="preserve">Không nên chọn phim cách nhiệt chỉ theo tên thương hiệu</w:t>
+        <w:t xml:space="preserve">Không nên chọn phim cách nhiệt chỉ theo thương hiệu</w:t>
       </w:r>
     </w:p>
     <w:p>
@@ -7607,7 +7978,7 @@
             </w:pPr>
             <w:r>
               <w:rPr/>
-              <w:t xml:space="preserve">Thường được nhắc đến ở nhóm phim cao cấp, có các dòng sử dụng công nghệ phản xạ/phún xạ kim                       loại.</w:t>
+              <w:t xml:space="preserve">V-Kool là một trong các thương hiệu phim cách nhiệt được người dùng tại Việt Nam tham khảo. Khi so sánh, nên xem mã phim cụ thể, thông số công bố, trải nghiệm quan sát và chính sách bảo hành.</w:t>
             </w:r>
           </w:p>
         </w:tc>
@@ -7688,7 +8059,7 @@
             </w:pPr>
             <w:r>
               <w:rPr/>
-              <w:t xml:space="preserve">Cần đối chiếu mã phim cụ thể, thông số và chính sách bảo hành tại đại lý thi công.</w:t>
+              <w:t xml:space="preserve">Cần đối chiếu mã phim cụ thể, thông số và chính sách bảo hành tại điểm thi công.</w:t>
             </w:r>
           </w:p>
         </w:tc>
@@ -9105,6 +9476,15 @@
     </w:p>
     <w:p>
       <w:pPr>
+        <w:spacing w:lineRule="auto"/>
+      </w:pPr>
+      <w:r>
+        <w:rPr/>
+        <w:t xml:space="preserve">Auto365.vn - Trụ Sở Chính là điểm tư vấn, thi công, nghiệm thu và hỗ trợ khách hàng thuộc hệ thống Auto365 trong hệ sinh thái 365Group.</w:t>
+      </w:r>
+    </w:p>
+    <w:p>
+      <w:pPr>
         <w:pStyle w:val="Heading3"/>
         <w:spacing w:lineRule="auto"/>
       </w:pPr>
@@ -9289,6 +9669,360 @@
       <w:r>
         <w:rPr/>
         <w:t xml:space="preserve">Đo kiểm hiệu năng thực tế nếu có.</w:t>
+      </w:r>
+    </w:p>
+    <w:p>
+      <w:pPr>
+        <w:pStyle w:val="Heading2"/>
+        <w:spacing w:lineRule="auto"/>
+      </w:pPr>
+      <w:r>
+        <w:rPr/>
+        <w:t xml:space="preserve">Checklist nghiệm thu sau khi dán phim cách nhiệt</w:t>
+      </w:r>
+    </w:p>
+    <w:p>
+      <w:pPr>
+        <w:spacing w:lineRule="auto"/>
+      </w:pPr>
+      <w:r>
+        <w:rPr/>
+        <w:t xml:space="preserve">Sau khi thi công, khách hàng nên kiểm tra lại từng vị trí kính, mã phim và thông tin bảo hành để đảm bảo cấu hình đúng với tư vấn ban đầu.</w:t>
+      </w:r>
+    </w:p>
+    <w:tbl>
+      <w:tblPr>
+        <w:tblBorders>
+          <w:top w:val="single" w:sz="2" w:space="0" w:color="000000"/>
+          <w:bottom w:val="single" w:sz="2" w:space="0" w:color="000000"/>
+          <w:left w:val="single" w:sz="2" w:space="0" w:color="000000"/>
+          <w:right w:val="single" w:sz="2" w:space="0" w:color="000000"/>
+        </w:tblBorders>
+        <w:tblCellSpacing w:w="0" w:type="dxa"/>
+        <w:tblCellMar>
+          <w:top w:type="dxa" w:w="80"/>
+          <w:bottom w:type="dxa" w:w="80"/>
+          <w:left w:type="dxa" w:w="160"/>
+          <w:right w:type="dxa" w:w="160"/>
+        </w:tblCellMar>
+        <w:jc w:val="center"/>
+      </w:tblPr>
+      <w:tblGrid>
+        <w:gridCol w:w="4320"/>
+        <w:gridCol w:w="4320"/>
+      </w:tblGrid>
+      <w:tr>
+        <w:trPr>
+          <w:cantSplit/>
+        </w:trPr>
+        <w:tc>
+          <w:tcPr>
+            <w:tcBorders>
+              <w:top w:val="single" w:sz="1" w:space="0" w:color="000000"/>
+              <w:bottom w:val="single" w:sz="1" w:space="0" w:color="000000"/>
+              <w:left w:val="single" w:sz="1" w:space="0" w:color="000000"/>
+              <w:right w:val="single" w:sz="1" w:space="0" w:color="000000"/>
+            </w:tcBorders>
+          </w:tcPr>
+          <w:p>
+            <w:pPr>
+              <w:spacing w:lineRule="auto"/>
+            </w:pPr>
+            <w:r>
+              <w:rPr/>
+              <w:t xml:space="preserve">Hạng mục nghiệm thu</w:t>
+            </w:r>
+          </w:p>
+        </w:tc>
+        <w:tc>
+          <w:tcPr>
+            <w:tcBorders>
+              <w:top w:val="single" w:sz="1" w:space="0" w:color="000000"/>
+              <w:bottom w:val="single" w:sz="1" w:space="0" w:color="000000"/>
+              <w:left w:val="single" w:sz="1" w:space="0" w:color="000000"/>
+              <w:right w:val="single" w:sz="1" w:space="0" w:color="000000"/>
+            </w:tcBorders>
+          </w:tcPr>
+          <w:p>
+            <w:pPr>
+              <w:spacing w:lineRule="auto"/>
+            </w:pPr>
+            <w:r>
+              <w:rPr/>
+              <w:t xml:space="preserve">Cần kiểm</w:t>
+            </w:r>
+          </w:p>
+        </w:tc>
+      </w:tr>
+      <w:tblGrid>
+        <w:gridCol w:w="4320"/>
+        <w:gridCol w:w="4320"/>
+      </w:tblGrid>
+      <w:tr>
+        <w:trPr>
+          <w:cantSplit/>
+        </w:trPr>
+        <w:tc>
+          <w:tcPr>
+            <w:tcBorders>
+              <w:top w:val="single" w:sz="1" w:space="0" w:color="000000"/>
+              <w:bottom w:val="single" w:sz="1" w:space="0" w:color="000000"/>
+              <w:left w:val="single" w:sz="1" w:space="0" w:color="000000"/>
+              <w:right w:val="single" w:sz="1" w:space="0" w:color="000000"/>
+            </w:tcBorders>
+          </w:tcPr>
+          <w:p>
+            <w:pPr>
+              <w:spacing w:lineRule="auto"/>
+            </w:pPr>
+            <w:r>
+              <w:rPr/>
+              <w:t xml:space="preserve">Mã phim</w:t>
+            </w:r>
+          </w:p>
+        </w:tc>
+        <w:tc>
+          <w:tcPr>
+            <w:tcBorders>
+              <w:top w:val="single" w:sz="1" w:space="0" w:color="000000"/>
+              <w:bottom w:val="single" w:sz="1" w:space="0" w:color="000000"/>
+              <w:left w:val="single" w:sz="1" w:space="0" w:color="000000"/>
+              <w:right w:val="single" w:sz="1" w:space="0" w:color="000000"/>
+            </w:tcBorders>
+          </w:tcPr>
+          <w:p>
+            <w:pPr>
+              <w:spacing w:lineRule="auto"/>
+            </w:pPr>
+            <w:r>
+              <w:rPr/>
+              <w:t xml:space="preserve">Đúng mã đã tư vấn theo từng vị trí kính</w:t>
+            </w:r>
+          </w:p>
+        </w:tc>
+      </w:tr>
+      <w:tr>
+        <w:trPr>
+          <w:cantSplit/>
+        </w:trPr>
+        <w:tc>
+          <w:tcPr>
+            <w:tcBorders>
+              <w:top w:val="single" w:sz="1" w:space="0" w:color="000000"/>
+              <w:bottom w:val="single" w:sz="1" w:space="0" w:color="000000"/>
+              <w:left w:val="single" w:sz="1" w:space="0" w:color="000000"/>
+              <w:right w:val="single" w:sz="1" w:space="0" w:color="000000"/>
+            </w:tcBorders>
+          </w:tcPr>
+          <w:p>
+            <w:pPr>
+              <w:spacing w:lineRule="auto"/>
+            </w:pPr>
+            <w:r>
+              <w:rPr/>
+              <w:t xml:space="preserve">Bề mặt kính</w:t>
+            </w:r>
+          </w:p>
+        </w:tc>
+        <w:tc>
+          <w:tcPr>
+            <w:tcBorders>
+              <w:top w:val="single" w:sz="1" w:space="0" w:color="000000"/>
+              <w:bottom w:val="single" w:sz="1" w:space="0" w:color="000000"/>
+              <w:left w:val="single" w:sz="1" w:space="0" w:color="000000"/>
+              <w:right w:val="single" w:sz="1" w:space="0" w:color="000000"/>
+            </w:tcBorders>
+          </w:tcPr>
+          <w:p>
+            <w:pPr>
+              <w:spacing w:lineRule="auto"/>
+            </w:pPr>
+            <w:r>
+              <w:rPr/>
+              <w:t xml:space="preserve">Không bụi lớn, không xước, không bong mép</w:t>
+            </w:r>
+          </w:p>
+        </w:tc>
+      </w:tr>
+      <w:tr>
+        <w:trPr>
+          <w:cantSplit/>
+        </w:trPr>
+        <w:tc>
+          <w:tcPr>
+            <w:tcBorders>
+              <w:top w:val="single" w:sz="1" w:space="0" w:color="000000"/>
+              <w:bottom w:val="single" w:sz="1" w:space="0" w:color="000000"/>
+              <w:left w:val="single" w:sz="1" w:space="0" w:color="000000"/>
+              <w:right w:val="single" w:sz="1" w:space="0" w:color="000000"/>
+            </w:tcBorders>
+          </w:tcPr>
+          <w:p>
+            <w:pPr>
+              <w:spacing w:lineRule="auto"/>
+            </w:pPr>
+            <w:r>
+              <w:rPr/>
+              <w:t xml:space="preserve">Mép phim</w:t>
+            </w:r>
+          </w:p>
+        </w:tc>
+        <w:tc>
+          <w:tcPr>
+            <w:tcBorders>
+              <w:top w:val="single" w:sz="1" w:space="0" w:color="000000"/>
+              <w:bottom w:val="single" w:sz="1" w:space="0" w:color="000000"/>
+              <w:left w:val="single" w:sz="1" w:space="0" w:color="000000"/>
+              <w:right w:val="single" w:sz="1" w:space="0" w:color="000000"/>
+            </w:tcBorders>
+          </w:tcPr>
+          <w:p>
+            <w:pPr>
+              <w:spacing w:lineRule="auto"/>
+            </w:pPr>
+            <w:r>
+              <w:rPr/>
+              <w:t xml:space="preserve">Cắt gọn, không hở bất thường</w:t>
+            </w:r>
+          </w:p>
+        </w:tc>
+      </w:tr>
+      <w:tr>
+        <w:trPr>
+          <w:cantSplit/>
+        </w:trPr>
+        <w:tc>
+          <w:tcPr>
+            <w:tcBorders>
+              <w:top w:val="single" w:sz="1" w:space="0" w:color="000000"/>
+              <w:bottom w:val="single" w:sz="1" w:space="0" w:color="000000"/>
+              <w:left w:val="single" w:sz="1" w:space="0" w:color="000000"/>
+              <w:right w:val="single" w:sz="1" w:space="0" w:color="000000"/>
+            </w:tcBorders>
+          </w:tcPr>
+          <w:p>
+            <w:pPr>
+              <w:spacing w:lineRule="auto"/>
+            </w:pPr>
+            <w:r>
+              <w:rPr/>
+              <w:t xml:space="preserve">Tầm nhìn</w:t>
+            </w:r>
+          </w:p>
+        </w:tc>
+        <w:tc>
+          <w:tcPr>
+            <w:tcBorders>
+              <w:top w:val="single" w:sz="1" w:space="0" w:color="000000"/>
+              <w:bottom w:val="single" w:sz="1" w:space="0" w:color="000000"/>
+              <w:left w:val="single" w:sz="1" w:space="0" w:color="000000"/>
+              <w:right w:val="single" w:sz="1" w:space="0" w:color="000000"/>
+            </w:tcBorders>
+          </w:tcPr>
+          <w:p>
+            <w:pPr>
+              <w:spacing w:lineRule="auto"/>
+            </w:pPr>
+            <w:r>
+              <w:rPr/>
+              <w:t xml:space="preserve">Kính lái và kính sườn trước rõ trong điều kiện thực tế</w:t>
+            </w:r>
+          </w:p>
+        </w:tc>
+      </w:tr>
+      <w:tr>
+        <w:trPr>
+          <w:cantSplit/>
+        </w:trPr>
+        <w:tc>
+          <w:tcPr>
+            <w:tcBorders>
+              <w:top w:val="single" w:sz="1" w:space="0" w:color="000000"/>
+              <w:bottom w:val="single" w:sz="1" w:space="0" w:color="000000"/>
+              <w:left w:val="single" w:sz="1" w:space="0" w:color="000000"/>
+              <w:right w:val="single" w:sz="1" w:space="0" w:color="000000"/>
+            </w:tcBorders>
+          </w:tcPr>
+          <w:p>
+            <w:pPr>
+              <w:spacing w:lineRule="auto"/>
+            </w:pPr>
+            <w:r>
+              <w:rPr/>
+              <w:t xml:space="preserve">Bảo hành</w:t>
+            </w:r>
+          </w:p>
+        </w:tc>
+        <w:tc>
+          <w:tcPr>
+            <w:tcBorders>
+              <w:top w:val="single" w:sz="1" w:space="0" w:color="000000"/>
+              <w:bottom w:val="single" w:sz="1" w:space="0" w:color="000000"/>
+              <w:left w:val="single" w:sz="1" w:space="0" w:color="000000"/>
+              <w:right w:val="single" w:sz="1" w:space="0" w:color="000000"/>
+            </w:tcBorders>
+          </w:tcPr>
+          <w:p>
+            <w:pPr>
+              <w:spacing w:lineRule="auto"/>
+            </w:pPr>
+            <w:r>
+              <w:rPr/>
+              <w:t xml:space="preserve">Có thông tin kích hoạt hoặc tra cứu bảo hành điện tử nếu áp dụng</w:t>
+            </w:r>
+          </w:p>
+        </w:tc>
+      </w:tr>
+      <w:tr>
+        <w:trPr>
+          <w:cantSplit/>
+        </w:trPr>
+        <w:tc>
+          <w:tcPr>
+            <w:tcBorders>
+              <w:top w:val="single" w:sz="1" w:space="0" w:color="000000"/>
+              <w:bottom w:val="single" w:sz="1" w:space="0" w:color="000000"/>
+              <w:left w:val="single" w:sz="1" w:space="0" w:color="000000"/>
+              <w:right w:val="single" w:sz="1" w:space="0" w:color="000000"/>
+            </w:tcBorders>
+          </w:tcPr>
+          <w:p>
+            <w:pPr>
+              <w:spacing w:lineRule="auto"/>
+            </w:pPr>
+            <w:r>
+              <w:rPr/>
+              <w:t xml:space="preserve">Hướng dẫn sau dán</w:t>
+            </w:r>
+          </w:p>
+        </w:tc>
+        <w:tc>
+          <w:tcPr>
+            <w:tcBorders>
+              <w:top w:val="single" w:sz="1" w:space="0" w:color="000000"/>
+              <w:bottom w:val="single" w:sz="1" w:space="0" w:color="000000"/>
+              <w:left w:val="single" w:sz="1" w:space="0" w:color="000000"/>
+              <w:right w:val="single" w:sz="1" w:space="0" w:color="000000"/>
+            </w:tcBorders>
+          </w:tcPr>
+          <w:p>
+            <w:pPr>
+              <w:spacing w:lineRule="auto"/>
+            </w:pPr>
+            <w:r>
+              <w:rPr/>
+              <w:t xml:space="preserve">Nắm rõ thời gian hạn chế lên/xuống kính, vệ sinh và chăm sóc sau khi dán</w:t>
+            </w:r>
+          </w:p>
+        </w:tc>
+      </w:tr>
+    </w:tbl>
+    <w:p>
+      <w:pPr>
+        <w:spacing w:lineRule="auto"/>
+      </w:pPr>
+      <w:r>
+        <w:rPr/>
       </w:r>
     </w:p>
     <w:p>
@@ -10105,15 +10839,6 @@
     </w:p>
     <w:p>
       <w:pPr>
-        <w:spacing w:lineRule="auto"/>
-      </w:pPr>
-      <w:r>
-        <w:rPr/>
-        <w:t xml:space="preserve">Đặt lịch dán phim cách nhiệt</w:t>
-      </w:r>
-    </w:p>
-    <w:p>
-      <w:pPr>
         <w:pStyle w:val="Heading3"/>
         <w:spacing w:lineRule="auto"/>
       </w:pPr>
@@ -10171,7 +10896,7 @@
       </w:pPr>
       <w:r>
         <w:rPr/>
-        <w:t xml:space="preserve">Để kiểm tra thêm về hệ sinh thái Auto365, 365Group và hoạt động 3M Pro Shop, khách hàng có thể tham khảo             các nội dung đã công bố về báo chí và hoạt động chứng nhận kỹ thuật.</w:t>
+        <w:t xml:space="preserve">Để kiểm tra thêm về hệ thống Auto365, 365Group và hoạt động 3M Pro Shop, khách hàng có thể tham khảo             các nội dung đã công bố về báo chí và hoạt động chứng nhận kỹ thuật.</w:t>
       </w:r>
     </w:p>
     <w:p>
@@ -10330,7 +11055,7 @@
           <w:color w:val="4b5563"/>
           <w:sz w:val="23"/>
         </w:rPr>
-        <w:t xml:space="preserve">Phim cách nhiệt ô tô là một lớp                 màng polyeste mỏng, tích hợp nhiều lớp vật liệu và công nghệ (như men gốm, kim loại, carbon, quang học)                 được dán lên bề mặt kính xe nhằm mục đích hỗ trợ cản nhiệt, giảm tia UV/IR và bảo vệ nội thất.</w:t>
+        <w:t xml:space="preserve">Phim cách nhiệt ô tô là một lớp                 màng polyester mỏng, tích hợp nhiều lớp vật liệu và công nghệ (như men gốm, kim loại, carbon, quang học)                 được dán lên bề mặt kính xe nhằm mục đích hỗ trợ cản nhiệt, giảm tia UV/IR và bảo vệ nội thất.</w:t>
       </w:r>
     </w:p>
     <w:p>
@@ -10582,7 +11307,7 @@
           <w:color w:val="4b5563"/>
           <w:sz w:val="23"/>
         </w:rPr>
-        <w:t xml:space="preserve">Phim 3M chính hãng được kích                 hoạt bảo hành điện tử trên hệ thống eWarranty của 3M Việt Nam. Khách hàng có thể tra cứu mã bảo hành qua                 website chính thức của 3M hoặc yêu cầu đại lý kiểm tra bằng máy test chuyên dụng.</w:t>
+        <w:t xml:space="preserve">Phim 3M chính hãng được kích                 hoạt bảo hành điện tử trên hệ thống eWarranty của 3M Việt Nam. Khách hàng có thể tra cứu mã bảo hành qua                 website chính thức của 3M </w:t>
       </w:r>
     </w:p>
     <w:p>
@@ -10851,7 +11576,7 @@
       </w:pPr>
       <w:r>
         <w:rPr/>
-        <w:t xml:space="preserve">Muốn mát rõ, chi phí hợp lý</w:t>
+        <w:t xml:space="preserve">Muốn mát rõ, hợp lý</w:t>
       </w:r>
     </w:p>
     <w:p>
@@ -10869,7 +11594,7 @@
       </w:pPr>
       <w:r>
         <w:rPr/>
-        <w:t xml:space="preserve">Xe gia đình / xe điện / nhiều kính</w:t>
+        <w:t xml:space="preserve">Xe gia đình / xe điện</w:t>
       </w:r>
     </w:p>
     <w:p>
@@ -10887,7 +11612,7 @@
       </w:pPr>
       <w:r>
         <w:rPr/>
-        <w:t xml:space="preserve">Cần tư vấn cửa sổ trời / panorama</w:t>
+        <w:t xml:space="preserve">Tư vấn cửa sổ trời</w:t>
       </w:r>
     </w:p>
     <w:p>

</xml_diff>